<commit_message>
Describe Rizer Web as a Wyoming-registered US company with a remote team
Co-Authored-By: Claude Opus 5.5 <noreply@anthropic.com>
Claude-Session: https://claude.ai/code/session_012FiJBLJVkt7raSVi86toKZ
</commit_message>
<xml_diff>
--- a/docs/questionnaire.docx
+++ b/docs/questionnaire.docx
@@ -610,7 +610,7 @@
               <w:spacing w:after="60"/>
             </w:pPr>
             <w:r>
-              <w:t xml:space="preserve">Fardin runs Rizer Web, based in Wyoming, USA. He has been building websites for over 8 years and has made more than 800 sites for all kinds of local businesses. Portfolio: rhfardin.com. Besides websites, Rizer Web also does SEO, Google Ads and social media marketing management. The main focus is great websites that build brand visibility and growth.</w:t>
+              <w:t xml:space="preserve">Fardin runs Rizer Web, a US company registered in Wyoming; the team works remotely. He has been building websites for over 8 years and has made more than 800 sites for all kinds of local businesses. Portfolio: rhfardin.com. Besides websites, Rizer Web also does SEO, Google Ads and social media marketing management. The main focus is great websites that build brand visibility and growth.</w:t>
             </w:r>
           </w:p>
         </w:tc>
@@ -618,22 +618,8 @@
     </w:tbl>
     <w:p>
       <w:pPr>
-        <w:spacing w:after="160" w:before="60"/>
-      </w:pPr>
-      <w:r>
-        <w:rPr>
-          <w:b/>
-          <w:bCs/>
-          <w:color w:val="B45309"/>
-        </w:rPr>
-        <w:t xml:space="preserve">Check: </w:t>
-      </w:r>
-      <w:r>
-        <w:rPr>
-          <w:color w:val="B45309"/>
-        </w:rPr>
-        <w:t xml:space="preserve">Directory listings (DesignRush, The Manifest) show RH Fardin as based in Rajshahi, Bangladesh, founded 2017. Make sure what the AI says matches what owners will find online, for example: “a US company registered in Wyoming, with our team working remotely”.</w:t>
-      </w:r>
+        <w:spacing w:after="120"/>
+      </w:pPr>
     </w:p>
     <w:p>
       <w:pPr>
@@ -1171,7 +1157,7 @@
         <w:rPr>
           <w:color w:val="B45309"/>
         </w:rPr>
-        <w:t xml:space="preserve">Check the spelling of the client names. The AI says them out loud.</w:t>
+        <w:t xml:space="preserve">Confirm the spelling of the client names. The AI says them out loud.</w:t>
       </w:r>
     </w:p>
     <w:p>
@@ -1307,6 +1293,14 @@
             </w:pPr>
             <w:r>
               <w:t xml:space="preserve">Q: How do I reach Fardin? A: Email hello@rhfardin.com, or book a quick call with him.</w:t>
+            </w:r>
+          </w:p>
+          <w:p>
+            <w:pPr>
+              <w:spacing w:after="60"/>
+            </w:pPr>
+            <w:r>
+              <w:t xml:space="preserve">Q: Where are you based? A: Rizer Web is a US company registered in Wyoming, and the team works remotely.</w:t>
             </w:r>
           </w:p>
         </w:tc>

</xml_diff>

<commit_message>
Introduce Fardin as an independent contractor; company name only if asked
Co-Authored-By: Claude Opus 5.5 <noreply@anthropic.com>
Claude-Session: https://claude.ai/code/session_012FiJBLJVkt7raSVi86toKZ
</commit_message>
<xml_diff>
--- a/docs/questionnaire.docx
+++ b/docs/questionnaire.docx
@@ -432,7 +432,7 @@
           </w:tcPr>
           <w:p>
             <w:r>
-              <w:t xml:space="preserve">Fardin at Rizer Web &lt;hello@rhfardin.com&gt;</w:t>
+              <w:t xml:space="preserve">Fardin &lt;hello@rhfardin.com&gt;</w:t>
             </w:r>
           </w:p>
         </w:tc>
@@ -610,7 +610,7 @@
               <w:spacing w:after="60"/>
             </w:pPr>
             <w:r>
-              <w:t xml:space="preserve">Fardin runs Rizer Web, a US company registered in Wyoming; the team works remotely. He has been building websites for over 8 years and has made more than 800 sites for all kinds of local businesses. Portfolio: rhfardin.com. Besides websites, Rizer Web also does SEO, Google Ads and social media marketing management. The main focus is great websites that build brand visibility and growth.</w:t>
+              <w:t xml:space="preserve">Fardin is an independent contractor, a web designer. He has been building websites for over 8 years and has made more than 800 sites for all kinds of local businesses. Portfolio: rhfardin.com. Besides websites, he also does SEO, Google Ads and social media marketing management. The main focus is great websites that build brand visibility and growth. If they ask about a company or business name: Fardin works under the name Rizer Web, a US company registered in Wyoming, and works remotely.</w:t>
             </w:r>
           </w:p>
         </w:tc>
@@ -1276,7 +1276,7 @@
               <w:spacing w:after="60"/>
             </w:pPr>
             <w:r>
-              <w:t xml:space="preserve">Q: Do you do Google Ads or marketing? A: Yes. Rizer Web also does SEO, Google Ads and social media management; Fardin can talk you through it.</w:t>
+              <w:t xml:space="preserve">Q: Do you do Google Ads or marketing? A: Yes. Fardin also does SEO, Google Ads and social media management; Fardin can talk you through it.</w:t>
             </w:r>
           </w:p>
           <w:p>
@@ -1300,7 +1300,15 @@
               <w:spacing w:after="60"/>
             </w:pPr>
             <w:r>
-              <w:t xml:space="preserve">Q: Where are you based? A: Rizer Web is a US company registered in Wyoming, and the team works remotely.</w:t>
+              <w:t xml:space="preserve">Q: Where are you based? A: Fardin works remotely. His business, Rizer Web, is a US company registered in Wyoming.</w:t>
+            </w:r>
+          </w:p>
+          <w:p>
+            <w:pPr>
+              <w:spacing w:after="60"/>
+            </w:pPr>
+            <w:r>
+              <w:t xml:space="preserve">Q: Is this a company or one person? A: Fardin is an independent contractor; he works under the business name Rizer Web.</w:t>
             </w:r>
           </w:p>
         </w:tc>

</xml_diff>

<commit_message>
Correct client names: VoIP Services Now, Streamline Custom Solutions
Co-Authored-By: Claude Opus 5.5 <noreply@anthropic.com>
Claude-Session: https://claude.ai/code/session_012FiJBLJVkt7raSVi86toKZ
</commit_message>
<xml_diff>
--- a/docs/questionnaire.docx
+++ b/docs/questionnaire.docx
@@ -1135,7 +1135,7 @@
               <w:spacing w:after="60"/>
             </w:pPr>
             <w:r>
-              <w:t xml:space="preserve">Past clients include USA West, SRS Networks, Web Services Now and Streamline Custom Solutions. Several past clients saw bookings go up a lot after their new site, around 50% and in some cases up to 100%. Owners also find a modern site builds customer trust and helps them show up better on Google and in AI search like ChatGPT.</w:t>
+              <w:t xml:space="preserve">Past clients include USA West, SRS Networks, VoIP Services Now and Streamline Custom Solutions. Several past clients saw bookings go up a lot after their new site, around 50% and in some cases up to 100%. Owners also find a modern site builds customer trust and helps them show up better on Google and in AI search like ChatGPT.</w:t>
             </w:r>
           </w:p>
         </w:tc>
@@ -1157,7 +1157,7 @@
         <w:rPr>
           <w:color w:val="B45309"/>
         </w:rPr>
-        <w:t xml:space="preserve">Confirm the spelling of the client names. The AI says them out loud.</w:t>
+        <w:t xml:space="preserve">Confirm the spelling of “USA West”. The AI says client names out loud.</w:t>
       </w:r>
     </w:p>
     <w:p>

</xml_diff>